<commit_message>
Proposta: ajuste de espaçamento das referências
Co-Authored-By: Claude Opus 5.5 <noreply@anthropic.com>
Claude-Session: https://claude.ai/code/session_01HxStpW4pQoDfJdTDYr6zEC
</commit_message>
<xml_diff>
--- a/proposta_3_paginas/PROPOSTA_PESQUISA_3_PAGINAS.docx
+++ b/proposta_3_paginas/PROPOSTA_PESQUISA_3_PAGINAS.docx
@@ -298,132 +298,132 @@
     </w:p>
     <w:p>
       <w:pPr>
-        <w:spacing w:line="240" w:lineRule="auto" w:after="60"/>
+        <w:spacing w:line="240" w:lineRule="auto" w:after="20"/>
       </w:pPr>
       <w:r>
         <w:rPr>
-          <w:sz w:val="20"/>
+          <w:sz w:val="18"/>
         </w:rPr>
         <w:t>BALL, S. J. Reformar escolas/reformar professores e os terrores da performatividade. Revista Portuguesa de Educação, Braga, v. 15, n. 2, p. 3-23, 2002.</w:t>
       </w:r>
     </w:p>
     <w:p>
       <w:pPr>
-        <w:spacing w:line="240" w:lineRule="auto" w:after="60"/>
+        <w:spacing w:line="240" w:lineRule="auto" w:after="20"/>
       </w:pPr>
       <w:r>
         <w:rPr>
-          <w:sz w:val="20"/>
+          <w:sz w:val="18"/>
         </w:rPr>
         <w:t>BALL, S. J. Performatividade, privatização e o pós-Estado do bem-estar. Educação &amp; Sociedade, Campinas, v. 25, n. 89, p. 1105-1126, 2004.</w:t>
       </w:r>
     </w:p>
     <w:p>
       <w:pPr>
-        <w:spacing w:line="240" w:lineRule="auto" w:after="60"/>
+        <w:spacing w:line="240" w:lineRule="auto" w:after="20"/>
       </w:pPr>
       <w:r>
         <w:rPr>
-          <w:sz w:val="20"/>
+          <w:sz w:val="18"/>
         </w:rPr>
         <w:t>BALL, S. J.; MAGUIRE, M.; BRAUN, A. Como as escolas fazem as políticas: atuação em escolas secundárias. Ponta Grossa: Editora UEPG, 2016.</w:t>
       </w:r>
     </w:p>
     <w:p>
       <w:pPr>
-        <w:spacing w:line="240" w:lineRule="auto" w:after="60"/>
+        <w:spacing w:line="240" w:lineRule="auto" w:after="20"/>
       </w:pPr>
       <w:r>
         <w:rPr>
-          <w:sz w:val="20"/>
+          <w:sz w:val="18"/>
         </w:rPr>
         <w:t>BOWE, R.; BALL, S. J.; GOLD, A. Reforming education and changing schools. London: Routledge, 1992.</w:t>
       </w:r>
     </w:p>
     <w:p>
       <w:pPr>
-        <w:spacing w:line="240" w:lineRule="auto" w:after="60"/>
+        <w:spacing w:line="240" w:lineRule="auto" w:after="20"/>
       </w:pPr>
       <w:r>
         <w:rPr>
-          <w:sz w:val="20"/>
+          <w:sz w:val="18"/>
         </w:rPr>
         <w:t>BRASIL. Lei nº 14.533, de 11 de janeiro de 2023. Institui a Política Nacional de Educação Digital. Brasília, DF: DOU, 2023.</w:t>
       </w:r>
     </w:p>
     <w:p>
       <w:pPr>
-        <w:spacing w:line="240" w:lineRule="auto" w:after="60"/>
+        <w:spacing w:line="240" w:lineRule="auto" w:after="20"/>
       </w:pPr>
       <w:r>
         <w:rPr>
-          <w:sz w:val="20"/>
+          <w:sz w:val="18"/>
         </w:rPr>
         <w:t>BRAUN, V.; CLARKE, V. Using thematic analysis in psychology. Qualitative Research in Psychology, v. 3, n. 2, p. 77-101, 2006. | Reflecting on reflexive thematic analysis. Qualitative Research in Sport, Exercise and Health, v. 11, n. 4, p. 589-597, 2019.</w:t>
       </w:r>
     </w:p>
     <w:p>
       <w:pPr>
-        <w:spacing w:line="240" w:lineRule="auto" w:after="60"/>
+        <w:spacing w:line="240" w:lineRule="auto" w:after="20"/>
       </w:pPr>
       <w:r>
         <w:rPr>
-          <w:sz w:val="20"/>
+          <w:sz w:val="18"/>
         </w:rPr>
         <w:t>HARGREAVES, A. Profesorado, cultura y postmodernidad: cambian los tiempos, cambia el profesorado. 5. ed. Madrid: Morata, 2005.</w:t>
       </w:r>
     </w:p>
     <w:p>
       <w:pPr>
-        <w:spacing w:line="240" w:lineRule="auto" w:after="60"/>
+        <w:spacing w:line="240" w:lineRule="auto" w:after="20"/>
       </w:pPr>
       <w:r>
         <w:rPr>
-          <w:sz w:val="20"/>
+          <w:sz w:val="18"/>
         </w:rPr>
         <w:t>MAINARDES, J. Abordagem do ciclo de políticas. Educação &amp; Sociedade, Campinas, v. 27, n. 94, p. 47-69, 2006.</w:t>
       </w:r>
     </w:p>
     <w:p>
       <w:pPr>
-        <w:spacing w:line="240" w:lineRule="auto" w:after="60"/>
+        <w:spacing w:line="240" w:lineRule="auto" w:after="20"/>
       </w:pPr>
       <w:r>
         <w:rPr>
-          <w:sz w:val="20"/>
+          <w:sz w:val="18"/>
         </w:rPr>
         <w:t>MASSEY, D. Pelo espaço: uma nova política da espacialidade. Rio de Janeiro: Bertrand Brasil, 2008.</w:t>
       </w:r>
     </w:p>
     <w:p>
       <w:pPr>
-        <w:spacing w:line="240" w:lineRule="auto" w:after="60"/>
+        <w:spacing w:line="240" w:lineRule="auto" w:after="20"/>
       </w:pPr>
       <w:r>
         <w:rPr>
-          <w:sz w:val="20"/>
+          <w:sz w:val="18"/>
         </w:rPr>
         <w:t>ONU. Comitê dos Direitos da Criança. Comentário Geral nº 25 (2021). CRC/C/GC/25. Genebra: ONU, 2021.</w:t>
       </w:r>
     </w:p>
     <w:p>
       <w:pPr>
-        <w:spacing w:line="240" w:lineRule="auto" w:after="60"/>
+        <w:spacing w:line="240" w:lineRule="auto" w:after="20"/>
       </w:pPr>
       <w:r>
         <w:rPr>
-          <w:sz w:val="20"/>
+          <w:sz w:val="18"/>
         </w:rPr>
         <w:t>SANTOS, M. O território e o saber local: algumas categorias de análise. Cadernos IPPUR, Rio de Janeiro, ano 13, n. 2, p. 15-26, 1999.</w:t>
       </w:r>
     </w:p>
     <w:p>
       <w:pPr>
-        <w:spacing w:line="240" w:lineRule="auto" w:after="60"/>
+        <w:spacing w:line="240" w:lineRule="auto" w:after="20"/>
       </w:pPr>
       <w:r>
         <w:rPr>
-          <w:sz w:val="20"/>
+          <w:sz w:val="18"/>
         </w:rPr>
         <w:t>YIN, R. K. Estudo de caso: planejamento e métodos. 2. ed. Porto Alegre: Bookman, 2001.</w:t>
       </w:r>

</xml_diff>

<commit_message>
Proposta: cada afirmação ancorada em conceito e autor
Co-Authored-By: Claude Opus 5.5 <noreply@anthropic.com>
Claude-Session: https://claude.ai/code/session_01HxStpW4pQoDfJdTDYr6zEC
</commit_message>
<xml_diff>
--- a/proposta_3_paginas/PROPOSTA_PESQUISA_3_PAGINAS.docx
+++ b/proposta_3_paginas/PROPOSTA_PESQUISA_3_PAGINAS.docx
@@ -38,12 +38,12 @@
     </w:p>
     <w:p>
       <w:pPr>
-        <w:spacing w:line="360" w:lineRule="auto" w:after="0"/>
+        <w:spacing w:line="276" w:lineRule="auto" w:after="0"/>
         <w:ind w:firstLine="709"/>
         <w:jc w:val="both"/>
       </w:pPr>
       <w:r>
-        <w:t>A Lei nº 14.533/2023 fez da educação digital um direito e um componente curricular do ensino fundamental, obrigatório nos currículos a partir de 2026, mas deixou a chegada dos meios à capacidade de cada ente federado, sem fundo próprio. É nessa distância que a pesquisa se situa. O objeto é a encenação da PNED, em seu eixo Educação Digital Escolar, pelos profissionais da educação que atuam nos anos iniciais (1º ao 5º ano) da Escola Municipal Domitila Castelo, no distrito de Pipa, em Tibau do Sul (RN). Chamamos de encenação o movimento pelo qual esses profissionais interpretam a política, produzindo sentidos sobre o que o texto pede, e a traduzem em ações, planejamentos e registros possíveis naquela escola, com aqueles recursos.</w:t>
+        <w:t>A Lei nº 14.533/2023 fez da educação digital um direito e, por meio do § 11 incluído no art. 26 da LDB, um componente curricular do ensino fundamental, com currículos obrigatórios a partir de 2026 (BRASIL, 1996; 2023; 2025). A mesma lei condiciona a inclusão digital aos “limites orçamentários” de cada órgão e não cria fundo próprio (BRASIL, 2023, arts. 2º e 11). É nessa distância, que chamamos de vazio material, que a pesquisa se situa. O objeto é a encenação da PNED, em seu eixo Educação Digital Escolar, pelos profissionais da educação dos anos iniciais (1º ao 5º ano) da Escola Municipal Domitila Castelo, em Pipa, Tibau do Sul (RN). Encenação é o nome que damos ao policy enactment de Ball, Maguire e Braun (2016), traduzido como atuação na edição brasileira: interpretar a política, produzindo sentidos sobre o que o texto pede, e traduzi-la em ações, planejamentos e registros possíveis naquela escola.</w:t>
       </w:r>
     </w:p>
     <w:p>
@@ -60,7 +60,7 @@
     </w:p>
     <w:p>
       <w:pPr>
-        <w:spacing w:line="360" w:lineRule="auto" w:after="0"/>
+        <w:spacing w:line="276" w:lineRule="auto" w:after="0"/>
         <w:ind w:firstLine="709"/>
         <w:jc w:val="both"/>
       </w:pPr>
@@ -82,7 +82,7 @@
     </w:p>
     <w:p>
       <w:pPr>
-        <w:spacing w:line="360" w:lineRule="auto" w:after="0"/>
+        <w:spacing w:line="276" w:lineRule="auto" w:after="0"/>
         <w:ind w:firstLine="709"/>
         <w:jc w:val="both"/>
       </w:pPr>
@@ -93,12 +93,12 @@
         <w:t>Geral:</w:t>
       </w:r>
       <w:r>
-        <w:t xml:space="preserve"> analisar a encenação da PNED pelos profissionais da educação no contexto da prática da Escola Municipal Domitila Castelo, investigando as dinâmicas de recontextualização e de resistência produzidas no cruzamento entre a normativa, as culturas profissionais da escola e as especificidades do território.</w:t>
+        <w:t xml:space="preserve"> analisar a encenação da PNED pelos profissionais da educação no contexto da prática (BOWE; BALL; GOLD, 1992) da escola investigada, investigando as dinâmicas de recontextualização e de resistência produzidas no cruzamento entre a normativa, as culturas profissionais e o território.</w:t>
       </w:r>
     </w:p>
     <w:p>
       <w:pPr>
-        <w:spacing w:line="360" w:lineRule="auto" w:after="0"/>
+        <w:spacing w:line="276" w:lineRule="auto" w:after="0"/>
         <w:ind w:firstLine="709"/>
         <w:jc w:val="both"/>
       </w:pPr>
@@ -109,7 +109,7 @@
         <w:t>Específicos:</w:t>
       </w:r>
       <w:r>
-        <w:t xml:space="preserve"> a) investigar como os diferentes profissionais decodificam os textos da PNED e os discursos sobre cultura digital a partir de suas culturas profissionais; b) mapear as táticas institucionais e pedagógicas mobilizadas para traduzir a política no cotidiano, considerando a dimensão material da escola e o território; c) identificar lógicas de performatividade derivadas das exigências da PNED e analisar as estratégias de ressignificação e de resistência adotadas diante delas.</w:t>
+        <w:t xml:space="preserve"> a) investigar como os diferentes profissionais decodificam os textos da PNED e os discursos sobre cultura digital a partir de suas culturas profissionais (HARGREAVES, 2005); b) mapear as táticas institucionais e pedagógicas mobilizadas para traduzir a política no cotidiano, considerando as dimensões material e situacional do contexto (BALL; MAGUIRE; BRAUN, 2016) e o território usado (SANTOS, 1999); c) identificar lógicas de performatividade (BALL, 2004) derivadas das exigências da PNED e analisar as estratégias de ressignificação e de resistência adotadas diante delas, inclusive as fabricações (BALL, 2002).</w:t>
       </w:r>
     </w:p>
     <w:p>
@@ -126,12 +126,12 @@
     </w:p>
     <w:p>
       <w:pPr>
-        <w:spacing w:line="360" w:lineRule="auto" w:after="0"/>
+        <w:spacing w:line="276" w:lineRule="auto" w:after="0"/>
         <w:ind w:firstLine="709"/>
         <w:jc w:val="both"/>
       </w:pPr>
       <w:r>
-        <w:t>A primeira é empírico-temporal: acompanhamos a PNED no momento em que a exigência curricular se torna obrigatória. A revisão sistemática que realizamos (PRISMA 2020) reuniu nove estudos; nenhum analisa a PNED, um só delimita o ciclo de alfabetização e nenhum trata de rede municipal de pequeno porte. A segunda é analítico-espacial: Pipa é força ativa do contexto da prática, e não cenário. No mesmo distrito, o digital move o turismo, a pesca segue no mesmo mar e as salas que registramos não têm dispositivo algum. A terceira é teórico-conceitual: em vez de medir a escola pelo acesso e de ler a distância entre a norma e a sala de aula como falha de implementação, propomos a noção de habitar o digital, que nomeia a experiência desigual de viver a cultura digital num mesmo território, e tomamos essa distância como processo político, no qual os profissionais também fazem política. A tese que propomos defender, como hipótese até o fim do campo, é a de que o território e as culturas profissionais operam, em Pipa, como espaços de ressignificação ou de resistência frente à PNED e à performatividade.</w:t>
+        <w:t>A primeira dimensão é empírico-temporal. Acompanhamos a PNED no momento em que a exigência curricular se torna obrigatória (BRASIL, 2025, art. 36). A revisão sistemática que realizamos, conduzida segundo a declaração PRISMA 2020 (PAGE et al., 2022), reuniu nove estudos: nenhum analisa a PNED, um só delimita o ciclo de alfabetização e nenhum trata de rede municipal de pequeno porte, resultado que vale para o recorte e as bases consultadas. A segunda é analítico-espacial. Com Santos (1999), tomamos Pipa como território usado, campo de forças entre o uso econômico e o uso social dos recursos, e, com Massey (2008), como lugar de encontro de trajetórias: o digital move o turismo, a pesca segue no mesmo mar e as salas que registramos não têm dispositivo algum. A terceira é teórico-conceitual. Ball (2011) critica as análises que localizam o problema na escola ou no professor e nunca nas políticas; seguindo essa crítica, recusamos a leitura da distância entre a norma e a sala de aula como falha de implementação e a tomamos como processo político, no qual os profissionais também fazem política (BALL; MAGUIRE; BRAUN, 2016). Para nomear o que o acesso não mede, propomos a noção de habitar o digital, construída nesta tese a partir do território usado e do lugar: a experiência desigual de viver a cultura digital num mesmo território. A tese que propomos defender, como hipótese até o fim do campo, é a de que o território e as culturas profissionais operam, em Pipa, como espaços de ressignificação ou de resistência frente à PNED e à performatividade.</w:t>
       </w:r>
     </w:p>
     <w:p>
@@ -148,12 +148,12 @@
     </w:p>
     <w:p>
       <w:pPr>
-        <w:spacing w:line="360" w:lineRule="auto" w:after="0"/>
+        <w:spacing w:line="276" w:lineRule="auto" w:after="0"/>
         <w:ind w:firstLine="709"/>
         <w:jc w:val="both"/>
       </w:pPr>
       <w:r>
-        <w:t>Com a Abordagem do Ciclo de Políticas (BOWE; BALL; GOLD, 1992; MAINARDES, 2006), tomamos a política como processo, interpretado e recriado no contexto da prática. A teoria da atuação (BALL; MAGUIRE; BRAUN, 2016) trata a escola como lugar onde a política também é feita e organiza a análise em quatro dimensões do contexto: situacional, culturas profissionais, material e externa. As culturas profissionais são lidas com Hargreaves (2005), em seu conteúdo (crenças, valores, hábitos) e em sua forma (os modos de relação entre os professores). A performatividade (BALL, 2004) e as fabricações (BALL, 2002) ajudam a ler as cobranças por registros e resultados. O território é território usado (SANTOS, 1999), e o lugar, encontro de trajetórias (MASSEY, 2008). Os direitos da criança no ambiente digital (provisão, participação e proteção) completam o quadro (ONU, 2021).</w:t>
+        <w:t>A Abordagem do Ciclo de Políticas sustenta a leitura da política como processo, que no contexto da prática é interpretado e recriado (BOWE; BALL; GOLD, 1992; MAINARDES, 2006). A teoria da atuação sustenta a ideia de que a escola também faz a política e organiza a análise em quatro dimensões do contexto: situacional, culturas profissionais, material e externa (BALL; MAGUIRE; BRAUN, 2016). As culturas profissionais são lidas em seu conteúdo, isto é, crenças, valores, hábitos e formas de fazer partilhados pelos professores, e em sua forma, isto é, os modos de relação entre eles (HARGREAVES, 2005, p. 189-191). A performatividade, como cultura de metas, comparações e prestação de contas (BALL, 2004), e as fabricações, versões da escola produzidas para serem avaliadas (BALL, 2002), sustentam a leitura das cobranças por registros e das respostas a elas. Os direitos da criança no ambiente digital, em suas dimensões de provisão, participação e proteção, orientam a leitura do que a escola consegue garantir (ONU, 2021).</w:t>
       </w:r>
     </w:p>
     <w:p>
@@ -170,17 +170,17 @@
     </w:p>
     <w:p>
       <w:pPr>
-        <w:spacing w:line="360" w:lineRule="auto" w:after="0"/>
+        <w:spacing w:line="276" w:lineRule="auto" w:after="0"/>
         <w:ind w:firstLine="709"/>
         <w:jc w:val="both"/>
       </w:pPr>
       <w:r>
-        <w:t>A pesquisa é qualitativa, crítico-interpretativa, organizada como estudo de caso (YIN, 2001). Participam todos os profissionais da educação dos anos iniciais que aceitarem o convite, porque todos constroem a política: docentes do 1º ao 5º ano, coordenação, direção e demais profissionais ligados às turmas. Os dados serão construídos em seis passos.</w:t>
+        <w:t>A pesquisa é qualitativa, pois trabalha com sentidos, valores e crenças (MINAYO, 2009), e se organiza como estudo de caso, investigação de um fenômeno contemporâneo em seu contexto real (YIN, 2001). Participam todos os profissionais da educação dos anos iniciais que aceitarem o convite, no sentido amplo da LDB (art. 61) e da Lei nº 14.817/2024, porque todos constroem a política (BALL; MAGUIRE; BRAUN, 2016): docentes do 1º ao 5º ano, coordenação, direção e demais profissionais ligados às turmas. Os dados serão construídos em seis passos.</w:t>
       </w:r>
     </w:p>
     <w:p>
       <w:pPr>
-        <w:spacing w:line="360" w:lineRule="auto" w:after="0"/>
+        <w:spacing w:line="276" w:lineRule="auto" w:after="0"/>
         <w:ind w:firstLine="709"/>
         <w:jc w:val="both"/>
       </w:pPr>
@@ -191,12 +191,12 @@
         <w:t>Passo 1, entrada e ética:</w:t>
       </w:r>
       <w:r>
-        <w:t xml:space="preserve"> emenda ao CEP, anuência da escola, TCLE e registro datado dos critérios de exame da hipótese antes da primeira entrevista.</w:t>
+        <w:t xml:space="preserve"> emenda ao CEP, anuência da escola e TCLE, conforme as Resoluções CNS nº 466/2012 e nº 510/2016; registro datado dos critérios de exame da hipótese antes da primeira entrevista, como proposições prévias que o campo pode recusar (YIN, 2001).</w:t>
       </w:r>
     </w:p>
     <w:p>
       <w:pPr>
-        <w:spacing w:line="360" w:lineRule="auto" w:after="0"/>
+        <w:spacing w:line="276" w:lineRule="auto" w:after="0"/>
         <w:ind w:firstLine="709"/>
         <w:jc w:val="both"/>
       </w:pPr>
@@ -207,12 +207,12 @@
         <w:t>Passo 2, análise documental:</w:t>
       </w:r>
       <w:r>
-        <w:t xml:space="preserve"> lei e veto, Resolução CNE/CEB nº 2/2025, PPP, planos de aula, atas, cadernos de uso do laboratório, registros de formação da Secretaria e documentos da PIEC.</w:t>
+        <w:t xml:space="preserve"> lei e veto, Resolução CNE/CEB nº 2/2025, PPP, planos de aula, atas, cadernos de uso do laboratório, registros de formação e documentos da PIEC, lidos com as questões analíticas dos contextos de influência, de produção do texto e da prática (MAINARDES, 2006).</w:t>
       </w:r>
     </w:p>
     <w:p>
       <w:pPr>
-        <w:spacing w:line="360" w:lineRule="auto" w:after="0"/>
+        <w:spacing w:line="276" w:lineRule="auto" w:after="0"/>
         <w:ind w:firstLine="709"/>
         <w:jc w:val="both"/>
       </w:pPr>
@@ -223,12 +223,12 @@
         <w:t>Passo 3, registro iconográfico:</w:t>
       </w:r>
       <w:r>
-        <w:t xml:space="preserve"> já realizado (38 figuras da escola e do acervo do Museu Digital de Pipa), a completar com testes de conexão nas salas.</w:t>
+        <w:t xml:space="preserve"> já realizado (38 figuras da escola e do acervo do Museu Digital de Pipa), lido com a noção de rugosidade, formas de outros tempos que permanecem quando se impõem novas funções (SANTOS, 2012); a completar com testes de conexão nas salas.</w:t>
       </w:r>
     </w:p>
     <w:p>
       <w:pPr>
-        <w:spacing w:line="360" w:lineRule="auto" w:after="0"/>
+        <w:spacing w:line="276" w:lineRule="auto" w:after="0"/>
         <w:ind w:firstLine="709"/>
         <w:jc w:val="both"/>
       </w:pPr>
@@ -239,12 +239,12 @@
         <w:t>Passo 4, questionário de perfil e percepções:</w:t>
       </w:r>
       <w:r>
-        <w:t xml:space="preserve"> presencial, em formulário digital, com cinco blocos (perfil, formação, condições materiais e território, PNED e registros, direitos da criança).</w:t>
+        <w:t xml:space="preserve"> presencial, em formulário digital, com cinco blocos ligados às dimensões do contexto (BALL; MAGUIRE; BRAUN, 2016) e aos direitos da criança (ONU, 2021).</w:t>
       </w:r>
     </w:p>
     <w:p>
       <w:pPr>
-        <w:spacing w:line="360" w:lineRule="auto" w:after="0"/>
+        <w:spacing w:line="276" w:lineRule="auto" w:after="0"/>
         <w:ind w:firstLine="709"/>
         <w:jc w:val="both"/>
       </w:pPr>
@@ -255,12 +255,12 @@
         <w:t>Passo 5, entrevistas semiestruturadas em profundidade:</w:t>
       </w:r>
       <w:r>
-        <w:t xml:space="preserve"> individuais, de 60 a 90 minutos, em seis eixos (culturas profissionais, interpretação, tradução, performatividade, resistência e direitos da criança), adaptadas a cada função. As categorias analíticas não aparecem nas perguntas.</w:t>
+        <w:t xml:space="preserve"> individuais, de 60 a 90 minutos, em seis eixos (culturas profissionais, interpretação, tradução, performatividade, resistência e direitos da criança), adaptadas a cada função. As categorias analíticas não aparecem nas perguntas, para não induzir respostas.</w:t>
       </w:r>
     </w:p>
     <w:p>
       <w:pPr>
-        <w:spacing w:line="360" w:lineRule="auto" w:after="0"/>
+        <w:spacing w:line="276" w:lineRule="auto" w:after="0"/>
         <w:ind w:firstLine="709"/>
         <w:jc w:val="both"/>
       </w:pPr>
@@ -271,12 +271,12 @@
         <w:t>Passo 6, análise e devolutiva:</w:t>
       </w:r>
       <w:r>
-        <w:t xml:space="preserve"> análise temática reflexiva (BRAUN; CLARKE, 2006, 2019), orientada pelas dimensões do contexto e pelo mapeamento de quatro movimentos (acomodação, omissão seletiva, tradução para fins locais e fabricação performativa), com triangulação das fontes, checagem dos relatos e devolução dos resultados à escola.</w:t>
+        <w:t xml:space="preserve"> análise temática reflexiva, na qual a subjetividade de quem analisa é recurso, e não viés (BRAUN; CLARKE, 2006, 2019), orientada pelas dimensões do contexto e pelo mapeamento de quatro movimentos: acomodação, omissão seletiva, tradução para fins locais (BALL; MAGUIRE; BRAUN, 2016) e fabricação performativa (BALL, 2002); triangulação das fontes (YIN, 2001), checagem dos relatos e devolução dos resultados à escola, como responsabilidade ética com o campo (MAINARDES, 2006).</w:t>
       </w:r>
     </w:p>
     <w:p>
       <w:pPr>
-        <w:spacing w:line="360" w:lineRule="auto" w:after="0"/>
+        <w:spacing w:line="276" w:lineRule="auto" w:after="0"/>
         <w:ind w:firstLine="709"/>
         <w:jc w:val="both"/>
       </w:pPr>
@@ -326,6 +326,17 @@
         <w:rPr>
           <w:sz w:val="18"/>
         </w:rPr>
+        <w:t>BALL, S. J. Sociologia das políticas educacionais e pesquisa crítico-social. In: BALL, S. J.; MAINARDES, J. (org.). Políticas educacionais: questões e dilemas. São Paulo: Cortez, 2011. p. 21-53.</w:t>
+      </w:r>
+    </w:p>
+    <w:p>
+      <w:pPr>
+        <w:spacing w:line="240" w:lineRule="auto" w:after="20"/>
+      </w:pPr>
+      <w:r>
+        <w:rPr>
+          <w:sz w:val="18"/>
+        </w:rPr>
         <w:t>BALL, S. J.; MAGUIRE, M.; BRAUN, A. Como as escolas fazem as políticas: atuação em escolas secundárias. Ponta Grossa: Editora UEPG, 2016.</w:t>
       </w:r>
     </w:p>
@@ -348,7 +359,7 @@
         <w:rPr>
           <w:sz w:val="18"/>
         </w:rPr>
-        <w:t>BRASIL. Lei nº 14.533, de 11 de janeiro de 2023. Institui a Política Nacional de Educação Digital. Brasília, DF: DOU, 2023.</w:t>
+        <w:t>BRASIL. Lei nº 9.394, de 20 de dezembro de 1996 (LDB). | Lei nº 14.533, de 11 de janeiro de 2023 (PNED). | Lei nº 14.817, de 16 de janeiro de 2024. | Conselho Nacional de Educação. Resolução CNE/CEB nº 2, de 21 de março de 2025. Brasília, DF: DOU.</w:t>
       </w:r>
     </w:p>
     <w:p>
@@ -403,6 +414,17 @@
         <w:rPr>
           <w:sz w:val="18"/>
         </w:rPr>
+        <w:t>MINAYO, M. C. S. (org.). Pesquisa social: teoria, método e criatividade. 28. ed. Petrópolis: Vozes, 2009.</w:t>
+      </w:r>
+    </w:p>
+    <w:p>
+      <w:pPr>
+        <w:spacing w:line="240" w:lineRule="auto" w:after="20"/>
+      </w:pPr>
+      <w:r>
+        <w:rPr>
+          <w:sz w:val="18"/>
+        </w:rPr>
         <w:t>ONU. Comitê dos Direitos da Criança. Comentário Geral nº 25 (2021). CRC/C/GC/25. Genebra: ONU, 2021.</w:t>
       </w:r>
     </w:p>
@@ -414,7 +436,18 @@
         <w:rPr>
           <w:sz w:val="18"/>
         </w:rPr>
-        <w:t>SANTOS, M. O território e o saber local: algumas categorias de análise. Cadernos IPPUR, Rio de Janeiro, ano 13, n. 2, p. 15-26, 1999.</w:t>
+        <w:t>PAGE, M. J. et al. A declaração PRISMA 2020. Epidemiologia e Serviços de Saúde, Brasília, v. 31, n. 2, e2022107, 2022.</w:t>
+      </w:r>
+    </w:p>
+    <w:p>
+      <w:pPr>
+        <w:spacing w:line="240" w:lineRule="auto" w:after="20"/>
+      </w:pPr>
+      <w:r>
+        <w:rPr>
+          <w:sz w:val="18"/>
+        </w:rPr>
+        <w:t>SANTOS, M. O território e o saber local. Cadernos IPPUR, ano 13, n. 2, p. 15-26, 1999. | Espaço e método. 5. ed. São Paulo: Edusp, 2012.</w:t>
       </w:r>
     </w:p>
     <w:p>

</xml_diff>